<commit_message>
A few updates on the manuscript
</commit_message>
<xml_diff>
--- a/writeup/InfluenzaAgriculture.docx
+++ b/writeup/InfluenzaAgriculture.docx
@@ -297,6 +297,192 @@
         <w:rPr>
           <w:szCs w:val="22"/>
         </w:rPr>
+        <w:t xml:space="preserve">Data on household size and household crowding are recorded separately. </w:t>
+      </w:r>
+      <w:r>
+        <w:rPr>
+          <w:szCs w:val="22"/>
+        </w:rPr>
+        <w:t xml:space="preserve">For our analysis, we need both values together, i.e., the fraction of households of a given size that are crowded. </w:t>
+      </w:r>
+      <w:r>
+        <w:rPr>
+          <w:szCs w:val="22"/>
+        </w:rPr>
+        <w:t xml:space="preserve">To assign crowding levels by household size, we used the relation </w:t>
+      </w:r>
+    </w:p>
+    <w:p>
+      <w:pPr>
+        <w:jc w:val="center"/>
+        <w:rPr>
+          <w:szCs w:val="22"/>
+        </w:rPr>
+      </w:pPr>
+      <w:r>
+        <w:rPr>
+          <w:szCs w:val="22"/>
+        </w:rPr>
+        <w:t>____</w:t>
+      </w:r>
+    </w:p>
+    <w:p>
+      <w:pPr>
+        <w:jc w:val="both"/>
+        <w:rPr>
+          <w:szCs w:val="22"/>
+        </w:rPr>
+      </w:pPr>
+    </w:p>
+    <w:p>
+      <w:pPr>
+        <w:jc w:val="both"/>
+        <w:rPr>
+          <w:szCs w:val="22"/>
+        </w:rPr>
+      </w:pPr>
+      <w:r>
+        <w:rPr>
+          <w:szCs w:val="22"/>
+        </w:rPr>
+        <w:t>Here, ____</w:t>
+      </w:r>
+      <w:r>
+        <w:rPr>
+          <w:szCs w:val="22"/>
+        </w:rPr>
+        <w:t xml:space="preserve"> (note that, by th</w:t>
+      </w:r>
+      <w:r>
+        <w:rPr>
+          <w:szCs w:val="22"/>
+        </w:rPr>
+        <w:t xml:space="preserve">e US Census </w:t>
+      </w:r>
+      <w:r>
+        <w:rPr>
+          <w:szCs w:val="22"/>
+        </w:rPr>
+        <w:t xml:space="preserve">definition </w:t>
+      </w:r>
+      <w:r>
+        <w:rPr>
+          <w:szCs w:val="22"/>
+        </w:rPr>
+        <w:t xml:space="preserve">of crowding, households of size 1 cannot be crowded). </w:t>
+      </w:r>
+      <w:r>
+        <w:rPr>
+          <w:szCs w:val="22"/>
+        </w:rPr>
+        <w:t xml:space="preserve">This relation ensures that </w:t>
+      </w:r>
+      <w:r>
+        <w:rPr>
+          <w:szCs w:val="22"/>
+        </w:rPr>
+        <w:t xml:space="preserve">the overall fraction of crowded households is maintained, while distributing that crowding differently among </w:t>
+      </w:r>
+      <w:r>
+        <w:rPr>
+          <w:szCs w:val="22"/>
+        </w:rPr>
+        <w:t>households of various sizes</w:t>
+      </w:r>
+      <w:r>
+        <w:rPr>
+          <w:szCs w:val="22"/>
+        </w:rPr>
+        <w:t xml:space="preserve">: the parameter ___ reflects how much more likely it is for a household of size 7+ to be crowded than a household of size 2. </w:t>
+      </w:r>
+      <w:r>
+        <w:rPr>
+          <w:szCs w:val="22"/>
+        </w:rPr>
+        <w:t xml:space="preserve">For the baseline analysis, we assumed _____, </w:t>
+      </w:r>
+      <w:r>
+        <w:rPr>
+          <w:i/>
+          <w:iCs/>
+          <w:szCs w:val="22"/>
+        </w:rPr>
+        <w:t>i.e.</w:t>
+      </w:r>
+      <w:r>
+        <w:rPr>
+          <w:szCs w:val="22"/>
+        </w:rPr>
+        <w:t>, all</w:t>
+      </w:r>
+      <w:r>
+        <w:rPr>
+          <w:szCs w:val="22"/>
+        </w:rPr>
+        <w:t xml:space="preserve"> households of size &gt; 1 </w:t>
+      </w:r>
+      <w:r>
+        <w:rPr>
+          <w:szCs w:val="22"/>
+        </w:rPr>
+        <w:t xml:space="preserve">are crowded at the same frequency. </w:t>
+      </w:r>
+      <w:r>
+        <w:rPr>
+          <w:szCs w:val="22"/>
+        </w:rPr>
+        <w:t xml:space="preserve">For sensitivity analyses, we allowed ____ to range up to ____, reflecting a scenario where households </w:t>
+      </w:r>
+      <w:r>
+        <w:rPr>
+          <w:szCs w:val="22"/>
+        </w:rPr>
+        <w:t xml:space="preserve">of </w:t>
+      </w:r>
+      <w:r>
+        <w:rPr>
+          <w:szCs w:val="22"/>
+        </w:rPr>
+        <w:t>size 7+ are ___</w:t>
+      </w:r>
+      <w:r>
+        <w:rPr>
+          <w:szCs w:val="22"/>
+        </w:rPr>
+        <w:t xml:space="preserve"> times</w:t>
+      </w:r>
+      <w:r>
+        <w:rPr>
+          <w:szCs w:val="22"/>
+        </w:rPr>
+        <w:t xml:space="preserve"> more likely to be crowded than households of size </w:t>
+      </w:r>
+      <w:r>
+        <w:rPr>
+          <w:szCs w:val="22"/>
+        </w:rPr>
+        <w:t xml:space="preserve">2. </w:t>
+      </w:r>
+    </w:p>
+    <w:p>
+      <w:pPr>
+        <w:jc w:val="both"/>
+        <w:rPr>
+          <w:szCs w:val="22"/>
+        </w:rPr>
+      </w:pPr>
+    </w:p>
+    <w:p>
+      <w:pPr>
+        <w:jc w:val="both"/>
+        <w:rPr>
+          <w:szCs w:val="22"/>
+        </w:rPr>
+      </w:pPr>
+      <w:r>
+        <w:rPr>
+          <w:szCs w:val="22"/>
+        </w:rPr>
         <w:t xml:space="preserve">For agricultural workers, </w:t>
       </w:r>
       <w:r>
@@ -443,8 +629,26 @@
           <w:bCs/>
           <w:szCs w:val="22"/>
         </w:rPr>
-        <w:t>Figure xx</w:t>
-      </w:r>
+        <w:t xml:space="preserve">Figure </w:t>
+      </w:r>
+      <w:proofErr w:type="spellStart"/>
+      <w:r>
+        <w:rPr>
+          <w:b/>
+          <w:bCs/>
+          <w:szCs w:val="22"/>
+        </w:rPr>
+        <w:t>S</w:t>
+      </w:r>
+      <w:r>
+        <w:rPr>
+          <w:b/>
+          <w:bCs/>
+          <w:szCs w:val="22"/>
+        </w:rPr>
+        <w:t>xx</w:t>
+      </w:r>
+      <w:proofErr w:type="spellEnd"/>
       <w:r>
         <w:rPr>
           <w:szCs w:val="22"/>
@@ -524,6 +728,7 @@
       <w:pPr>
         <w:jc w:val="both"/>
         <w:rPr>
+          <w:rFonts w:eastAsiaTheme="minorEastAsia"/>
           <w:szCs w:val="22"/>
           <w:lang w:val="en-GB"/>
         </w:rPr>
@@ -553,23 +758,7 @@
           <w:szCs w:val="22"/>
           <w:lang w:val="en-GB"/>
         </w:rPr>
-        <w:t xml:space="preserve">used </w:t>
-      </w:r>
-      <w:proofErr w:type="gramStart"/>
-      <w:r>
-        <w:rPr>
-          <w:szCs w:val="22"/>
-          <w:lang w:val="en-GB"/>
-        </w:rPr>
-        <w:t>estimates</w:t>
-      </w:r>
-      <w:proofErr w:type="gramEnd"/>
-      <w:r>
-        <w:rPr>
-          <w:szCs w:val="22"/>
-          <w:lang w:val="en-GB"/>
-        </w:rPr>
-        <w:t xml:space="preserve"> of the secondary attack rate. </w:t>
+        <w:t xml:space="preserve">used estimates of the secondary attack rate. </w:t>
       </w:r>
       <w:r>
         <w:rPr>
@@ -643,7 +832,14 @@
           <w:szCs w:val="22"/>
           <w:lang w:val="en-GB"/>
         </w:rPr>
-        <w:t xml:space="preserve">is the recovery rate. </w:t>
+        <w:t>is the recovery rate</w:t>
+      </w:r>
+      <w:r>
+        <w:rPr>
+          <w:szCs w:val="22"/>
+          <w:lang w:val="en-GB"/>
+        </w:rPr>
+        <w:t xml:space="preserve">. </w:t>
       </w:r>
       <w:r>
         <w:rPr>
@@ -664,7 +860,21 @@
           <w:szCs w:val="22"/>
           <w:lang w:val="en-GB"/>
         </w:rPr>
-        <w:t xml:space="preserve"> = 1/5 for a mean recovery time of 5 days), we can calculate </w:t>
+        <w:t xml:space="preserve"> = 1/5 for a mean recovery time of 5 days</w:t>
+      </w:r>
+      <w:r>
+        <w:rPr>
+          <w:szCs w:val="22"/>
+          <w:lang w:val="en-GB"/>
+        </w:rPr>
+        <w:t xml:space="preserve"> [x]</w:t>
+      </w:r>
+      <w:r>
+        <w:rPr>
+          <w:szCs w:val="22"/>
+          <w:lang w:val="en-GB"/>
+        </w:rPr>
+        <w:t xml:space="preserve">), we can calculate </w:t>
       </w:r>
       <w:r>
         <w:rPr>
@@ -791,22 +1001,45 @@
           <w:szCs w:val="22"/>
           <w:lang w:val="en-GB"/>
         </w:rPr>
-        <w:t xml:space="preserve">value that yielded a reproduction number of 1.2. In sensitivity analyses, we considered reproduction numbers from 1.1 – 3. </w:t>
-      </w:r>
-    </w:p>
-    <w:p>
-      <w:pPr>
-        <w:jc w:val="both"/>
-        <w:rPr>
-          <w:szCs w:val="22"/>
-          <w:lang w:val="en-GB"/>
-        </w:rPr>
-      </w:pPr>
-    </w:p>
-    <w:p>
-      <w:pPr>
-        <w:jc w:val="both"/>
-        <w:rPr>
+        <w:t xml:space="preserve">value that yielded a reproduction number of 1.2. </w:t>
+      </w:r>
+      <w:r>
+        <w:rPr>
+          <w:szCs w:val="22"/>
+          <w:lang w:val="en-GB"/>
+        </w:rPr>
+        <w:t xml:space="preserve">This reflects the estimated reproduction number for influenza [x] and is in line with the effective reproduction </w:t>
+      </w:r>
+      <w:r>
+        <w:rPr>
+          <w:szCs w:val="22"/>
+          <w:lang w:val="en-GB"/>
+        </w:rPr>
+        <w:lastRenderedPageBreak/>
+        <w:t xml:space="preserve">number during surges of COVID-19 [x]. </w:t>
+      </w:r>
+      <w:r>
+        <w:rPr>
+          <w:szCs w:val="22"/>
+          <w:lang w:val="en-GB"/>
+        </w:rPr>
+        <w:t xml:space="preserve">In sensitivity analyses, we considered reproduction numbers from 1.1 – 3. </w:t>
+      </w:r>
+    </w:p>
+    <w:p>
+      <w:pPr>
+        <w:jc w:val="both"/>
+        <w:rPr>
+          <w:szCs w:val="22"/>
+          <w:lang w:val="en-GB"/>
+        </w:rPr>
+      </w:pPr>
+    </w:p>
+    <w:p>
+      <w:pPr>
+        <w:jc w:val="both"/>
+        <w:rPr>
+          <w:rFonts w:eastAsiaTheme="minorEastAsia"/>
           <w:szCs w:val="22"/>
           <w:lang w:val="en-GB"/>
         </w:rPr>
@@ -830,69 +1063,381 @@
           <w:szCs w:val="22"/>
           <w:lang w:val="en-GB"/>
         </w:rPr>
-        <w:t xml:space="preserve">agricultural workers </w:t>
-      </w:r>
-    </w:p>
-    <w:p>
-      <w:pPr>
-        <w:jc w:val="both"/>
-        <w:rPr>
-          <w:szCs w:val="22"/>
-          <w:lang w:val="en-GB"/>
-        </w:rPr>
-      </w:pPr>
-    </w:p>
-    <w:p>
-      <w:pPr>
-        <w:jc w:val="both"/>
-        <w:rPr>
-          <w:szCs w:val="22"/>
-          <w:u w:val="single"/>
-        </w:rPr>
-      </w:pPr>
-      <w:r>
-        <w:rPr>
-          <w:noProof/>
-          <w:szCs w:val="22"/>
-          <w:u w:val="single"/>
-        </w:rPr>
-        <w:lastRenderedPageBreak/>
-        <w:drawing>
-          <wp:inline distT="0" distB="0" distL="0" distR="0" wp14:anchorId="6D12843E" wp14:editId="6BC092DC">
-            <wp:extent cx="3902298" cy="3248997"/>
-            <wp:effectExtent l="0" t="0" r="0" b="2540"/>
-            <wp:docPr id="513926667" name="Picture 1"/>
-            <wp:cNvGraphicFramePr>
-              <a:graphicFrameLocks xmlns:a="http://schemas.openxmlformats.org/drawingml/2006/main" noChangeAspect="1"/>
-            </wp:cNvGraphicFramePr>
-            <a:graphic xmlns:a="http://schemas.openxmlformats.org/drawingml/2006/main">
-              <a:graphicData uri="http://schemas.openxmlformats.org/drawingml/2006/picture">
-                <pic:pic xmlns:pic="http://schemas.openxmlformats.org/drawingml/2006/picture">
-                  <pic:nvPicPr>
-                    <pic:cNvPr id="513926667" name=""/>
-                    <pic:cNvPicPr/>
-                  </pic:nvPicPr>
-                  <pic:blipFill>
-                    <a:blip r:embed="rId5"/>
-                    <a:stretch>
-                      <a:fillRect/>
-                    </a:stretch>
-                  </pic:blipFill>
-                  <pic:spPr>
-                    <a:xfrm>
-                      <a:off x="0" y="0"/>
-                      <a:ext cx="3931372" cy="3273204"/>
-                    </a:xfrm>
-                    <a:prstGeom prst="rect">
-                      <a:avLst/>
-                    </a:prstGeom>
-                  </pic:spPr>
-                </pic:pic>
-              </a:graphicData>
-            </a:graphic>
-          </wp:inline>
-        </w:drawing>
-      </w:r>
+        <w:t>agricultural workers</w:t>
+      </w:r>
+      <w:r>
+        <w:rPr>
+          <w:szCs w:val="22"/>
+          <w:lang w:val="en-GB"/>
+        </w:rPr>
+        <w:t xml:space="preserve">, we </w:t>
+      </w:r>
+      <w:r>
+        <w:rPr>
+          <w:szCs w:val="22"/>
+          <w:lang w:val="en-GB"/>
+        </w:rPr>
+        <w:t>defined a mixing matrix</w:t>
+      </w:r>
+      <w:r>
+        <w:rPr>
+          <w:szCs w:val="22"/>
+          <w:lang w:val="en-GB"/>
+        </w:rPr>
+        <w:t xml:space="preserve"> with parameter </w:t>
+      </w:r>
+      <m:oMath>
+        <m:r>
+          <m:rPr>
+            <m:sty m:val="p"/>
+          </m:rPr>
+          <w:rPr>
+            <w:rFonts w:ascii="Cambria Math" w:hAnsi="Cambria Math"/>
+            <w:szCs w:val="22"/>
+            <w:lang w:val="en-GB"/>
+          </w:rPr>
+          <m:t>ϵ</m:t>
+        </m:r>
+      </m:oMath>
+      <w:r>
+        <w:rPr>
+          <w:rFonts w:eastAsiaTheme="minorEastAsia"/>
+          <w:szCs w:val="22"/>
+          <w:lang w:val="en-GB"/>
+        </w:rPr>
+        <w:t xml:space="preserve">, where </w:t>
+      </w:r>
+      <m:oMath>
+        <m:r>
+          <m:rPr>
+            <m:sty m:val="p"/>
+          </m:rPr>
+          <w:rPr>
+            <w:rFonts w:ascii="Cambria Math" w:eastAsiaTheme="minorEastAsia" w:hAnsi="Cambria Math"/>
+            <w:szCs w:val="22"/>
+            <w:lang w:val="en-GB"/>
+          </w:rPr>
+          <m:t>ϵ∈</m:t>
+        </m:r>
+        <m:d>
+          <m:dPr>
+            <m:begChr m:val="["/>
+            <m:endChr m:val="]"/>
+            <m:ctrlPr>
+              <w:rPr>
+                <w:rFonts w:ascii="Cambria Math" w:eastAsiaTheme="minorEastAsia" w:hAnsi="Cambria Math"/>
+                <w:i/>
+                <w:szCs w:val="22"/>
+                <w:lang w:val="en-GB"/>
+              </w:rPr>
+            </m:ctrlPr>
+          </m:dPr>
+          <m:e>
+            <m:r>
+              <w:rPr>
+                <w:rFonts w:ascii="Cambria Math" w:eastAsiaTheme="minorEastAsia" w:hAnsi="Cambria Math"/>
+                <w:szCs w:val="22"/>
+                <w:lang w:val="en-GB"/>
+              </w:rPr>
+              <m:t>0,1</m:t>
+            </m:r>
+          </m:e>
+        </m:d>
+      </m:oMath>
+      <w:r>
+        <w:rPr>
+          <w:rFonts w:eastAsiaTheme="minorEastAsia"/>
+          <w:szCs w:val="22"/>
+          <w:lang w:val="en-GB"/>
+        </w:rPr>
+        <w:t xml:space="preserve"> reflects a continuum between perfectly random mixing (</w:t>
+      </w:r>
+      <m:oMath>
+        <m:r>
+          <m:rPr>
+            <m:sty m:val="p"/>
+          </m:rPr>
+          <w:rPr>
+            <w:rFonts w:ascii="Cambria Math" w:eastAsiaTheme="minorEastAsia" w:hAnsi="Cambria Math"/>
+            <w:szCs w:val="22"/>
+            <w:lang w:val="en-GB"/>
+          </w:rPr>
+          <m:t>ϵ</m:t>
+        </m:r>
+        <m:r>
+          <w:rPr>
+            <w:rFonts w:ascii="Cambria Math" w:eastAsiaTheme="minorEastAsia" w:hAnsi="Cambria Math"/>
+            <w:szCs w:val="22"/>
+            <w:lang w:val="en-GB"/>
+          </w:rPr>
+          <m:t>= 0</m:t>
+        </m:r>
+      </m:oMath>
+      <w:r>
+        <w:rPr>
+          <w:rFonts w:eastAsiaTheme="minorEastAsia"/>
+          <w:szCs w:val="22"/>
+          <w:lang w:val="en-GB"/>
+        </w:rPr>
+        <w:t xml:space="preserve">) and strictly group-based mixing, </w:t>
+      </w:r>
+      <w:r>
+        <w:rPr>
+          <w:rFonts w:eastAsiaTheme="minorEastAsia"/>
+          <w:i/>
+          <w:iCs/>
+          <w:szCs w:val="22"/>
+          <w:lang w:val="en-GB"/>
+        </w:rPr>
+        <w:t>i.e.</w:t>
+      </w:r>
+      <w:r>
+        <w:rPr>
+          <w:rFonts w:eastAsiaTheme="minorEastAsia"/>
+          <w:szCs w:val="22"/>
+          <w:lang w:val="en-GB"/>
+        </w:rPr>
+        <w:t xml:space="preserve">, agricultural workers only interact with other agricultural </w:t>
+      </w:r>
+      <w:r>
+        <w:rPr>
+          <w:rFonts w:eastAsiaTheme="minorEastAsia"/>
+          <w:szCs w:val="22"/>
+          <w:lang w:val="en-GB"/>
+        </w:rPr>
+        <w:t>workers</w:t>
+      </w:r>
+      <w:r>
+        <w:rPr>
+          <w:rFonts w:eastAsiaTheme="minorEastAsia"/>
+          <w:szCs w:val="22"/>
+          <w:lang w:val="en-GB"/>
+        </w:rPr>
+        <w:t xml:space="preserve"> and </w:t>
+      </w:r>
+      <w:r>
+        <w:rPr>
+          <w:rFonts w:eastAsiaTheme="minorEastAsia"/>
+          <w:i/>
+          <w:iCs/>
+          <w:szCs w:val="22"/>
+          <w:lang w:val="en-GB"/>
+        </w:rPr>
+        <w:t>vice versa</w:t>
+      </w:r>
+      <w:r>
+        <w:rPr>
+          <w:rFonts w:eastAsiaTheme="minorEastAsia"/>
+          <w:szCs w:val="22"/>
+          <w:lang w:val="en-GB"/>
+        </w:rPr>
+        <w:t xml:space="preserve"> (</w:t>
+      </w:r>
+      <m:oMath>
+        <m:r>
+          <m:rPr>
+            <m:sty m:val="p"/>
+          </m:rPr>
+          <w:rPr>
+            <w:rFonts w:ascii="Cambria Math" w:eastAsiaTheme="minorEastAsia" w:hAnsi="Cambria Math"/>
+            <w:szCs w:val="22"/>
+            <w:lang w:val="en-GB"/>
+          </w:rPr>
+          <m:t>ϵ</m:t>
+        </m:r>
+        <m:r>
+          <w:rPr>
+            <w:rFonts w:ascii="Cambria Math" w:eastAsiaTheme="minorEastAsia" w:hAnsi="Cambria Math"/>
+            <w:szCs w:val="22"/>
+            <w:lang w:val="en-GB"/>
+          </w:rPr>
+          <m:t>= 1</m:t>
+        </m:r>
+      </m:oMath>
+      <w:r>
+        <w:rPr>
+          <w:rFonts w:eastAsiaTheme="minorEastAsia"/>
+          <w:szCs w:val="22"/>
+          <w:lang w:val="en-GB"/>
+        </w:rPr>
+        <w:t xml:space="preserve">). </w:t>
+      </w:r>
+      <w:r>
+        <w:rPr>
+          <w:rFonts w:eastAsiaTheme="minorEastAsia"/>
+          <w:szCs w:val="22"/>
+          <w:lang w:val="en-GB"/>
+        </w:rPr>
+        <w:t>We used a basel</w:t>
+      </w:r>
+      <w:r>
+        <w:rPr>
+          <w:rFonts w:eastAsiaTheme="minorEastAsia"/>
+          <w:szCs w:val="22"/>
+          <w:lang w:val="en-GB"/>
+        </w:rPr>
+        <w:t>in</w:t>
+      </w:r>
+      <w:r>
+        <w:rPr>
+          <w:rFonts w:eastAsiaTheme="minorEastAsia"/>
+          <w:szCs w:val="22"/>
+          <w:lang w:val="en-GB"/>
+        </w:rPr>
+        <w:t xml:space="preserve">e value of </w:t>
+      </w:r>
+      <m:oMath>
+        <m:r>
+          <m:rPr>
+            <m:sty m:val="p"/>
+          </m:rPr>
+          <w:rPr>
+            <w:rFonts w:ascii="Cambria Math" w:eastAsiaTheme="minorEastAsia" w:hAnsi="Cambria Math"/>
+            <w:szCs w:val="22"/>
+            <w:lang w:val="en-GB"/>
+          </w:rPr>
+          <m:t>ϵ</m:t>
+        </m:r>
+        <m:r>
+          <w:rPr>
+            <w:rFonts w:ascii="Cambria Math" w:eastAsiaTheme="minorEastAsia" w:hAnsi="Cambria Math"/>
+            <w:szCs w:val="22"/>
+            <w:lang w:val="en-GB"/>
+          </w:rPr>
+          <m:t xml:space="preserve">= </m:t>
+        </m:r>
+      </m:oMath>
+      <w:r>
+        <w:rPr>
+          <w:rFonts w:eastAsiaTheme="minorEastAsia"/>
+          <w:szCs w:val="22"/>
+          <w:lang w:val="en-GB"/>
+        </w:rPr>
+        <w:t xml:space="preserve">_____. In the sensitivity analyses, we considered </w:t>
+      </w:r>
+      <m:oMath>
+        <m:r>
+          <m:rPr>
+            <m:sty m:val="p"/>
+          </m:rPr>
+          <w:rPr>
+            <w:rFonts w:ascii="Cambria Math" w:eastAsiaTheme="minorEastAsia" w:hAnsi="Cambria Math"/>
+            <w:szCs w:val="22"/>
+            <w:lang w:val="en-GB"/>
+          </w:rPr>
+          <m:t>ϵ</m:t>
+        </m:r>
+        <m:r>
+          <w:rPr>
+            <w:rFonts w:ascii="Cambria Math" w:eastAsiaTheme="minorEastAsia" w:hAnsi="Cambria Math"/>
+            <w:szCs w:val="22"/>
+            <w:lang w:val="en-GB"/>
+          </w:rPr>
+          <m:t xml:space="preserve">= </m:t>
+        </m:r>
+      </m:oMath>
+      <w:r>
+        <w:rPr>
+          <w:rFonts w:eastAsiaTheme="minorEastAsia"/>
+          <w:szCs w:val="22"/>
+          <w:lang w:val="en-GB"/>
+        </w:rPr>
+        <w:t>____, ____, and ____</w:t>
+      </w:r>
+      <w:r>
+        <w:rPr>
+          <w:rFonts w:eastAsiaTheme="minorEastAsia"/>
+          <w:szCs w:val="22"/>
+          <w:lang w:val="en-GB"/>
+        </w:rPr>
+        <w:t xml:space="preserve"> (</w:t>
+      </w:r>
+      <w:r>
+        <w:rPr>
+          <w:rFonts w:eastAsiaTheme="minorEastAsia"/>
+          <w:b/>
+          <w:bCs/>
+          <w:szCs w:val="22"/>
+          <w:lang w:val="en-GB"/>
+        </w:rPr>
+        <w:t>Supplementary Information</w:t>
+      </w:r>
+      <w:r>
+        <w:rPr>
+          <w:rFonts w:eastAsiaTheme="minorEastAsia"/>
+          <w:szCs w:val="22"/>
+          <w:lang w:val="en-GB"/>
+        </w:rPr>
+        <w:t xml:space="preserve">). </w:t>
+      </w:r>
+    </w:p>
+    <w:p>
+      <w:pPr>
+        <w:jc w:val="both"/>
+        <w:rPr>
+          <w:rFonts w:eastAsiaTheme="minorEastAsia"/>
+          <w:szCs w:val="22"/>
+          <w:lang w:val="en-GB"/>
+        </w:rPr>
+      </w:pPr>
+    </w:p>
+    <w:p>
+      <w:pPr>
+        <w:jc w:val="both"/>
+        <w:rPr>
+          <w:rFonts w:eastAsiaTheme="minorEastAsia"/>
+          <w:szCs w:val="22"/>
+          <w:lang w:val="en-GB"/>
+        </w:rPr>
+      </w:pPr>
+    </w:p>
+    <w:p>
+      <w:pPr>
+        <w:jc w:val="both"/>
+        <w:rPr>
+          <w:rFonts w:eastAsiaTheme="minorEastAsia"/>
+          <w:szCs w:val="22"/>
+          <w:lang w:val="en-GB"/>
+        </w:rPr>
+      </w:pPr>
+    </w:p>
+    <w:p>
+      <w:pPr>
+        <w:jc w:val="both"/>
+        <w:rPr>
+          <w:rFonts w:eastAsiaTheme="minorEastAsia"/>
+          <w:szCs w:val="22"/>
+          <w:lang w:val="en-GB"/>
+        </w:rPr>
+      </w:pPr>
+    </w:p>
+    <w:p>
+      <w:pPr>
+        <w:jc w:val="both"/>
+        <w:rPr>
+          <w:rFonts w:eastAsiaTheme="minorEastAsia"/>
+          <w:szCs w:val="22"/>
+          <w:lang w:val="en-GB"/>
+        </w:rPr>
+      </w:pPr>
+    </w:p>
+    <w:p>
+      <w:pPr>
+        <w:jc w:val="both"/>
+        <w:rPr>
+          <w:szCs w:val="22"/>
+          <w:lang w:val="en-GB"/>
+        </w:rPr>
+      </w:pPr>
+    </w:p>
+    <w:p>
+      <w:pPr>
+        <w:jc w:val="both"/>
+        <w:rPr>
+          <w:szCs w:val="22"/>
+          <w:u w:val="single"/>
+        </w:rPr>
+      </w:pPr>
       <w:r>
         <w:rPr>
           <w:szCs w:val="22"/>
@@ -1709,8 +2254,9 @@
       <w:pPr>
         <w:jc w:val="both"/>
         <w:rPr>
-          <w:szCs w:val="22"/>
-          <w:u w:val="single"/>
+          <w:b/>
+          <w:bCs/>
+          <w:szCs w:val="22"/>
         </w:rPr>
       </w:pPr>
       <w:r>
@@ -1755,37 +2301,13 @@
         </w:rPr>
         <w:t>.</w:t>
       </w:r>
-    </w:p>
-    <w:p>
-      <w:pPr>
-        <w:jc w:val="both"/>
-        <w:rPr>
-          <w:b/>
-          <w:bCs/>
-          <w:szCs w:val="22"/>
-        </w:rPr>
-      </w:pPr>
-    </w:p>
-    <w:p>
-      <w:pPr>
-        <w:jc w:val="both"/>
-        <w:rPr>
-          <w:szCs w:val="22"/>
-        </w:rPr>
-      </w:pPr>
-      <w:r>
-        <w:rPr>
-          <w:szCs w:val="22"/>
-          <w:u w:val="single"/>
-        </w:rPr>
-        <w:t xml:space="preserve">Household </w:t>
-      </w:r>
-      <w:r>
-        <w:rPr>
-          <w:szCs w:val="22"/>
-          <w:u w:val="single"/>
-        </w:rPr>
-        <w:t>crowding leads to higher disease prevalence among agricultural workers.</w:t>
+      <w:r>
+        <w:rPr>
+          <w:b/>
+          <w:bCs/>
+          <w:szCs w:val="22"/>
+        </w:rPr>
+        <w:t xml:space="preserve"> </w:t>
       </w:r>
     </w:p>
     <w:p>
@@ -1804,7 +2326,19 @@
         <w:rPr>
           <w:szCs w:val="22"/>
         </w:rPr>
-        <w:t xml:space="preserve">For regional models, we see higher peak and higher final size </w:t>
+        <w:t>Mean h</w:t>
+      </w:r>
+      <w:r>
+        <w:rPr>
+          <w:szCs w:val="22"/>
+        </w:rPr>
+        <w:t xml:space="preserve">ousehold </w:t>
+      </w:r>
+      <w:r>
+        <w:rPr>
+          <w:szCs w:val="22"/>
+        </w:rPr>
+        <w:t xml:space="preserve">size is similar among agricultural households and the general population, though households with 4+ individuals tend to be more common for households with an agricultural worker. </w:t>
       </w:r>
     </w:p>
     <w:p>
@@ -1823,7 +2357,39 @@
         <w:rPr>
           <w:szCs w:val="22"/>
         </w:rPr>
-        <w:t xml:space="preserve">These differences are sensitive to the reproduction number </w:t>
+        <w:t xml:space="preserve">Crowding, on the other hand, is substantially higher among agricultural worker households. </w:t>
+      </w:r>
+    </w:p>
+    <w:p>
+      <w:pPr>
+        <w:jc w:val="both"/>
+        <w:rPr>
+          <w:b/>
+          <w:bCs/>
+          <w:szCs w:val="22"/>
+        </w:rPr>
+      </w:pPr>
+    </w:p>
+    <w:p>
+      <w:pPr>
+        <w:jc w:val="both"/>
+        <w:rPr>
+          <w:szCs w:val="22"/>
+        </w:rPr>
+      </w:pPr>
+      <w:r>
+        <w:rPr>
+          <w:szCs w:val="22"/>
+          <w:u w:val="single"/>
+        </w:rPr>
+        <w:t xml:space="preserve">Household </w:t>
+      </w:r>
+      <w:r>
+        <w:rPr>
+          <w:szCs w:val="22"/>
+          <w:u w:val="single"/>
+        </w:rPr>
+        <w:t>crowding leads to higher disease prevalence among agricultural workers.</w:t>
       </w:r>
     </w:p>
     <w:p>
@@ -1842,32 +2408,7 @@
         <w:rPr>
           <w:szCs w:val="22"/>
         </w:rPr>
-        <w:t>These differences are reflected in county-level simulations</w:t>
-      </w:r>
-    </w:p>
-    <w:p>
-      <w:pPr>
-        <w:jc w:val="both"/>
-        <w:rPr>
-          <w:b/>
-          <w:bCs/>
-          <w:szCs w:val="22"/>
-        </w:rPr>
-      </w:pPr>
-    </w:p>
-    <w:p>
-      <w:pPr>
-        <w:jc w:val="both"/>
-        <w:rPr>
-          <w:szCs w:val="22"/>
-        </w:rPr>
-      </w:pPr>
-      <w:r>
-        <w:rPr>
-          <w:szCs w:val="22"/>
-          <w:u w:val="single"/>
-        </w:rPr>
-        <w:t>Respiratory disease outbreaks among agricultural workers can lead to major productivity losses.</w:t>
+        <w:t xml:space="preserve">For regional models, we see higher peak and higher final size </w:t>
       </w:r>
     </w:p>
     <w:p>
@@ -1886,13 +2427,7 @@
         <w:rPr>
           <w:szCs w:val="22"/>
         </w:rPr>
-        <w:t xml:space="preserve">Overall productivity loss </w:t>
-      </w:r>
-      <w:r>
-        <w:rPr>
-          <w:szCs w:val="22"/>
-        </w:rPr>
-        <w:t xml:space="preserve">under basic assumptions </w:t>
+        <w:t xml:space="preserve">These differences are sensitive to the reproduction number </w:t>
       </w:r>
     </w:p>
     <w:p>
@@ -1911,33 +2446,32 @@
         <w:rPr>
           <w:szCs w:val="22"/>
         </w:rPr>
-        <w:t xml:space="preserve">Integration with </w:t>
-      </w:r>
-      <w:proofErr w:type="spellStart"/>
-      <w:r>
-        <w:rPr>
-          <w:szCs w:val="22"/>
-        </w:rPr>
-        <w:t>FoodTwin</w:t>
-      </w:r>
-      <w:proofErr w:type="spellEnd"/>
-      <w:r>
-        <w:rPr>
-          <w:szCs w:val="22"/>
-        </w:rPr>
-        <w:t xml:space="preserve">: </w:t>
-      </w:r>
-      <w:r>
-        <w:rPr>
-          <w:szCs w:val="22"/>
-        </w:rPr>
-        <w:t xml:space="preserve">losses by sector </w:t>
-      </w:r>
-      <w:r>
-        <w:rPr>
-          <w:szCs w:val="22"/>
-        </w:rPr>
-        <w:t>by geography</w:t>
+        <w:t>These differences are reflected in county-level simulations</w:t>
+      </w:r>
+    </w:p>
+    <w:p>
+      <w:pPr>
+        <w:jc w:val="both"/>
+        <w:rPr>
+          <w:b/>
+          <w:bCs/>
+          <w:szCs w:val="22"/>
+        </w:rPr>
+      </w:pPr>
+    </w:p>
+    <w:p>
+      <w:pPr>
+        <w:jc w:val="both"/>
+        <w:rPr>
+          <w:szCs w:val="22"/>
+        </w:rPr>
+      </w:pPr>
+      <w:r>
+        <w:rPr>
+          <w:szCs w:val="22"/>
+          <w:u w:val="single"/>
+        </w:rPr>
+        <w:t>Respiratory disease outbreaks among agricultural workers can lead to major productivity losses.</w:t>
       </w:r>
     </w:p>
     <w:p>
@@ -1956,102 +2490,13 @@
         <w:rPr>
           <w:szCs w:val="22"/>
         </w:rPr>
-        <w:t xml:space="preserve">Case studies: </w:t>
-      </w:r>
-      <w:r>
-        <w:rPr>
-          <w:szCs w:val="22"/>
-        </w:rPr>
-        <w:t>Harvesting l</w:t>
-      </w:r>
-      <w:r>
-        <w:rPr>
-          <w:szCs w:val="22"/>
-        </w:rPr>
-        <w:t xml:space="preserve">osses by season </w:t>
-      </w:r>
-      <w:r>
-        <w:rPr>
-          <w:szCs w:val="22"/>
-        </w:rPr>
-        <w:t xml:space="preserve">for three major crops </w:t>
-      </w:r>
-      <w:r>
-        <w:rPr>
-          <w:szCs w:val="22"/>
-        </w:rPr>
-        <w:t xml:space="preserve">(the seasonality of the outbreak will impact which crops are most affected). </w:t>
-      </w:r>
-    </w:p>
-    <w:p>
-      <w:pPr>
-        <w:jc w:val="both"/>
-        <w:rPr>
-          <w:b/>
-          <w:bCs/>
-          <w:szCs w:val="22"/>
-        </w:rPr>
-      </w:pPr>
-    </w:p>
-    <w:p>
-      <w:pPr>
-        <w:jc w:val="both"/>
-        <w:rPr>
-          <w:b/>
-          <w:bCs/>
-          <w:szCs w:val="22"/>
-        </w:rPr>
-      </w:pPr>
-      <w:r>
-        <w:rPr>
-          <w:b/>
-          <w:bCs/>
-          <w:szCs w:val="22"/>
-        </w:rPr>
-        <w:br w:type="page"/>
-      </w:r>
-    </w:p>
-    <w:p>
-      <w:pPr>
-        <w:jc w:val="both"/>
-        <w:rPr>
-          <w:b/>
-          <w:bCs/>
-          <w:szCs w:val="22"/>
-        </w:rPr>
-      </w:pPr>
-      <w:r>
-        <w:rPr>
-          <w:b/>
-          <w:bCs/>
-          <w:szCs w:val="22"/>
-        </w:rPr>
-        <w:lastRenderedPageBreak/>
-        <w:t xml:space="preserve">Discussion. </w:t>
-      </w:r>
-    </w:p>
-    <w:p>
-      <w:pPr>
-        <w:jc w:val="both"/>
-        <w:rPr>
-          <w:b/>
-          <w:bCs/>
-          <w:szCs w:val="22"/>
-        </w:rPr>
-      </w:pPr>
-    </w:p>
-    <w:p>
-      <w:pPr>
-        <w:jc w:val="both"/>
-        <w:rPr>
-          <w:szCs w:val="22"/>
-        </w:rPr>
-      </w:pPr>
-      <w:r>
-        <w:rPr>
-          <w:szCs w:val="22"/>
-        </w:rPr>
-        <w:t xml:space="preserve">Findings: </w:t>
+        <w:t xml:space="preserve">Overall productivity loss </w:t>
+      </w:r>
+      <w:r>
+        <w:rPr>
+          <w:szCs w:val="22"/>
+        </w:rPr>
+        <w:t xml:space="preserve">under basic assumptions </w:t>
       </w:r>
     </w:p>
     <w:p>
@@ -2066,43 +2511,112 @@
           <w:szCs w:val="22"/>
         </w:rPr>
       </w:pPr>
-      <w:proofErr w:type="spellStart"/>
-      <w:r>
-        <w:rPr>
-          <w:szCs w:val="22"/>
-        </w:rPr>
-        <w:t>Asdf</w:t>
-      </w:r>
-      <w:proofErr w:type="spellEnd"/>
-      <w:r>
-        <w:rPr>
-          <w:szCs w:val="22"/>
-        </w:rPr>
-        <w:t xml:space="preserve"> </w:t>
-      </w:r>
-    </w:p>
-    <w:p>
-      <w:pPr>
-        <w:jc w:val="both"/>
-        <w:rPr>
-          <w:b/>
-          <w:bCs/>
-          <w:szCs w:val="22"/>
-        </w:rPr>
-      </w:pPr>
-    </w:p>
-    <w:p>
-      <w:pPr>
-        <w:jc w:val="both"/>
-        <w:rPr>
-          <w:szCs w:val="22"/>
-        </w:rPr>
-      </w:pPr>
-      <w:r>
-        <w:rPr>
-          <w:szCs w:val="22"/>
-        </w:rPr>
-        <w:t>Context:</w:t>
+      <w:r>
+        <w:rPr>
+          <w:szCs w:val="22"/>
+        </w:rPr>
+        <w:t xml:space="preserve">Case studies: </w:t>
+      </w:r>
+      <w:r>
+        <w:rPr>
+          <w:szCs w:val="22"/>
+        </w:rPr>
+        <w:t>Harvesting l</w:t>
+      </w:r>
+      <w:r>
+        <w:rPr>
+          <w:szCs w:val="22"/>
+        </w:rPr>
+        <w:t xml:space="preserve">osses by season </w:t>
+      </w:r>
+      <w:r>
+        <w:rPr>
+          <w:szCs w:val="22"/>
+        </w:rPr>
+        <w:t xml:space="preserve">for three major crops </w:t>
+      </w:r>
+      <w:r>
+        <w:rPr>
+          <w:szCs w:val="22"/>
+        </w:rPr>
+        <w:t xml:space="preserve">(the seasonality of the outbreak will impact which crops are most affected). </w:t>
+      </w:r>
+      <w:r>
+        <w:rPr>
+          <w:szCs w:val="22"/>
+        </w:rPr>
+        <w:t xml:space="preserve">Do this for California. </w:t>
+      </w:r>
+    </w:p>
+    <w:p>
+      <w:pPr>
+        <w:jc w:val="both"/>
+        <w:rPr>
+          <w:b/>
+          <w:bCs/>
+          <w:szCs w:val="22"/>
+        </w:rPr>
+      </w:pPr>
+    </w:p>
+    <w:p>
+      <w:pPr>
+        <w:jc w:val="both"/>
+        <w:rPr>
+          <w:b/>
+          <w:bCs/>
+          <w:szCs w:val="22"/>
+        </w:rPr>
+      </w:pPr>
+      <w:r>
+        <w:rPr>
+          <w:b/>
+          <w:bCs/>
+          <w:szCs w:val="22"/>
+        </w:rPr>
+        <w:br w:type="page"/>
+      </w:r>
+    </w:p>
+    <w:p>
+      <w:pPr>
+        <w:jc w:val="both"/>
+        <w:rPr>
+          <w:b/>
+          <w:bCs/>
+          <w:szCs w:val="22"/>
+        </w:rPr>
+      </w:pPr>
+      <w:r>
+        <w:rPr>
+          <w:b/>
+          <w:bCs/>
+          <w:szCs w:val="22"/>
+        </w:rPr>
+        <w:lastRenderedPageBreak/>
+        <w:t xml:space="preserve">Discussion. </w:t>
+      </w:r>
+    </w:p>
+    <w:p>
+      <w:pPr>
+        <w:jc w:val="both"/>
+        <w:rPr>
+          <w:b/>
+          <w:bCs/>
+          <w:szCs w:val="22"/>
+        </w:rPr>
+      </w:pPr>
+    </w:p>
+    <w:p>
+      <w:pPr>
+        <w:jc w:val="both"/>
+        <w:rPr>
+          <w:szCs w:val="22"/>
+        </w:rPr>
+      </w:pPr>
+      <w:r>
+        <w:rPr>
+          <w:szCs w:val="22"/>
+        </w:rPr>
+        <w:t xml:space="preserve">Findings: </w:t>
       </w:r>
     </w:p>
     <w:p>
@@ -2122,32 +2636,38 @@
         <w:rPr>
           <w:szCs w:val="22"/>
         </w:rPr>
-        <w:t>asdf</w:t>
+        <w:t>Asdf</w:t>
       </w:r>
       <w:proofErr w:type="spellEnd"/>
-    </w:p>
-    <w:p>
-      <w:pPr>
-        <w:jc w:val="both"/>
-        <w:rPr>
-          <w:b/>
-          <w:bCs/>
-          <w:szCs w:val="22"/>
-        </w:rPr>
-      </w:pPr>
-    </w:p>
-    <w:p>
-      <w:pPr>
-        <w:jc w:val="both"/>
-        <w:rPr>
-          <w:szCs w:val="22"/>
-        </w:rPr>
-      </w:pPr>
-      <w:r>
-        <w:rPr>
-          <w:szCs w:val="22"/>
-        </w:rPr>
-        <w:t xml:space="preserve">Limitations: </w:t>
+      <w:r>
+        <w:rPr>
+          <w:szCs w:val="22"/>
+        </w:rPr>
+        <w:t xml:space="preserve"> </w:t>
+      </w:r>
+    </w:p>
+    <w:p>
+      <w:pPr>
+        <w:jc w:val="both"/>
+        <w:rPr>
+          <w:b/>
+          <w:bCs/>
+          <w:szCs w:val="22"/>
+        </w:rPr>
+      </w:pPr>
+    </w:p>
+    <w:p>
+      <w:pPr>
+        <w:jc w:val="both"/>
+        <w:rPr>
+          <w:szCs w:val="22"/>
+        </w:rPr>
+      </w:pPr>
+      <w:r>
+        <w:rPr>
+          <w:szCs w:val="22"/>
+        </w:rPr>
+        <w:t>Context:</w:t>
       </w:r>
     </w:p>
     <w:p>
@@ -2159,16 +2679,40 @@
         </w:numPr>
         <w:jc w:val="both"/>
         <w:rPr>
-          <w:b/>
-          <w:bCs/>
-          <w:szCs w:val="22"/>
-        </w:rPr>
-      </w:pPr>
-      <w:r>
-        <w:rPr>
-          <w:szCs w:val="22"/>
-        </w:rPr>
-        <w:t xml:space="preserve">No disease transmission seasonality </w:t>
+          <w:szCs w:val="22"/>
+        </w:rPr>
+      </w:pPr>
+      <w:proofErr w:type="spellStart"/>
+      <w:r>
+        <w:rPr>
+          <w:szCs w:val="22"/>
+        </w:rPr>
+        <w:t>asdf</w:t>
+      </w:r>
+      <w:proofErr w:type="spellEnd"/>
+    </w:p>
+    <w:p>
+      <w:pPr>
+        <w:jc w:val="both"/>
+        <w:rPr>
+          <w:b/>
+          <w:bCs/>
+          <w:szCs w:val="22"/>
+        </w:rPr>
+      </w:pPr>
+    </w:p>
+    <w:p>
+      <w:pPr>
+        <w:jc w:val="both"/>
+        <w:rPr>
+          <w:szCs w:val="22"/>
+        </w:rPr>
+      </w:pPr>
+      <w:r>
+        <w:rPr>
+          <w:szCs w:val="22"/>
+        </w:rPr>
+        <w:t xml:space="preserve">Limitations: </w:t>
       </w:r>
     </w:p>
     <w:p>
@@ -2189,7 +2733,7 @@
         <w:rPr>
           <w:szCs w:val="22"/>
         </w:rPr>
-        <w:t>Lack of county-level information on agricultural workers</w:t>
+        <w:t xml:space="preserve">No disease transmission seasonality </w:t>
       </w:r>
     </w:p>
     <w:p>
@@ -2210,7 +2754,7 @@
         <w:rPr>
           <w:szCs w:val="22"/>
         </w:rPr>
-        <w:t xml:space="preserve">Lack of information on assortativity of contacts </w:t>
+        <w:t>Lack of county-level information on agricultural workers</w:t>
       </w:r>
     </w:p>
     <w:p>
@@ -2231,7 +2775,7 @@
         <w:rPr>
           <w:szCs w:val="22"/>
         </w:rPr>
-        <w:t xml:space="preserve">Lack of other things that could impact transmission risk (e.g., exposure to chemicals – NAWS finds higher rates of baseline respiratory disease in ag workers; differentials in comorbidities; differences in access to care). </w:t>
+        <w:t xml:space="preserve">Lack of information on assortativity of contacts </w:t>
       </w:r>
     </w:p>
     <w:p>
@@ -2243,14 +2787,16 @@
         </w:numPr>
         <w:jc w:val="both"/>
         <w:rPr>
-          <w:szCs w:val="22"/>
-        </w:rPr>
-      </w:pPr>
-      <w:r>
-        <w:rPr>
-          <w:szCs w:val="22"/>
-        </w:rPr>
-        <w:t xml:space="preserve">Focus on just three labor intensive crops, but the impacts will be felt more broadly. </w:t>
+          <w:b/>
+          <w:bCs/>
+          <w:szCs w:val="22"/>
+        </w:rPr>
+      </w:pPr>
+      <w:r>
+        <w:rPr>
+          <w:szCs w:val="22"/>
+        </w:rPr>
+        <w:t xml:space="preserve">Lack of other things that could impact transmission risk (e.g., exposure to chemicals – NAWS finds higher rates of baseline respiratory disease in ag workers; differentials in comorbidities; differences in access to care). </w:t>
       </w:r>
     </w:p>
     <w:p>
@@ -2269,7 +2815,7 @@
         <w:rPr>
           <w:szCs w:val="22"/>
         </w:rPr>
-        <w:t xml:space="preserve">Impact of respiratory viral disease on the food system extends well beyond harvests, extending to food processing (e.g., meat processing during the COVID-19 pandemic) and demand-side issues (stockpiling, or avoiding certain food products for fear of disease) </w:t>
+        <w:t xml:space="preserve">Focus on just three labor intensive crops, but the impacts will be felt more broadly. </w:t>
       </w:r>
     </w:p>
     <w:p>
@@ -2288,6 +2834,25 @@
         <w:rPr>
           <w:szCs w:val="22"/>
         </w:rPr>
+        <w:t xml:space="preserve">Impact of respiratory viral disease on the food system extends well beyond harvests, extending to food processing (e.g., meat processing during the COVID-19 pandemic) and demand-side issues (stockpiling, or avoiding certain food products for fear of disease) </w:t>
+      </w:r>
+    </w:p>
+    <w:p>
+      <w:pPr>
+        <w:pStyle w:val="ListParagraph"/>
+        <w:numPr>
+          <w:ilvl w:val="0"/>
+          <w:numId w:val="11"/>
+        </w:numPr>
+        <w:jc w:val="both"/>
+        <w:rPr>
+          <w:szCs w:val="22"/>
+        </w:rPr>
+      </w:pPr>
+      <w:r>
+        <w:rPr>
+          <w:szCs w:val="22"/>
+        </w:rPr>
         <w:t xml:space="preserve">Consider the impact of human disease; the impact of animal and plant diseases has been examined elsewhere; we haven’t considered zoonotic/cross-species jumps of disease, where maybe both humans and birds could be infected.  </w:t>
       </w:r>
     </w:p>
@@ -2368,7 +2933,7 @@
           <w:szCs w:val="22"/>
         </w:rPr>
         <w:drawing>
-          <wp:inline distT="0" distB="0" distL="0" distR="0" wp14:anchorId="584FAB00" wp14:editId="2DA93AD3">
+          <wp:inline distT="0" distB="0" distL="0" distR="0" wp14:anchorId="584FAB00" wp14:editId="1883BD2E">
             <wp:extent cx="5156200" cy="5448300"/>
             <wp:effectExtent l="0" t="0" r="0" b="0"/>
             <wp:docPr id="594262345" name="Picture 1"/>
@@ -2412,6 +2977,30 @@
     </w:p>
     <w:p>
       <w:pPr>
+        <w:pStyle w:val="Caption"/>
+        <w:rPr>
+          <w:b w:val="0"/>
+          <w:bCs/>
+          <w:szCs w:val="22"/>
+        </w:rPr>
+      </w:pPr>
+      <w:r>
+        <w:t xml:space="preserve">Figure </w:t>
+      </w:r>
+      <w:fldSimple w:instr=" SEQ Figure \* ARABIC ">
+        <w:r>
+          <w:rPr>
+            <w:noProof/>
+          </w:rPr>
+          <w:t>1</w:t>
+        </w:r>
+      </w:fldSimple>
+      <w:r>
+        <w:t xml:space="preserve">. Household composition among agricultural workers and the general US population. </w:t>
+      </w:r>
+    </w:p>
+    <w:p>
+      <w:pPr>
         <w:rPr>
           <w:b/>
           <w:bCs/>
@@ -2452,6 +3041,98 @@
           <w:szCs w:val="22"/>
         </w:rPr>
         <w:t>.</w:t>
+      </w:r>
+    </w:p>
+    <w:p>
+      <w:pPr>
+        <w:jc w:val="both"/>
+        <w:rPr>
+          <w:b/>
+          <w:bCs/>
+          <w:szCs w:val="22"/>
+        </w:rPr>
+      </w:pPr>
+    </w:p>
+    <w:p>
+      <w:pPr>
+        <w:jc w:val="both"/>
+        <w:rPr>
+          <w:szCs w:val="22"/>
+        </w:rPr>
+      </w:pPr>
+      <w:r>
+        <w:rPr>
+          <w:szCs w:val="22"/>
+          <w:u w:val="single"/>
+        </w:rPr>
+        <w:t>Mathematical model</w:t>
+      </w:r>
+      <w:r>
+        <w:rPr>
+          <w:szCs w:val="22"/>
+          <w:u w:val="single"/>
+        </w:rPr>
+        <w:t>.</w:t>
+      </w:r>
+    </w:p>
+    <w:p>
+      <w:pPr>
+        <w:jc w:val="both"/>
+        <w:rPr>
+          <w:szCs w:val="22"/>
+        </w:rPr>
+      </w:pPr>
+    </w:p>
+    <w:p>
+      <w:pPr>
+        <w:jc w:val="both"/>
+        <w:rPr>
+          <w:b/>
+          <w:bCs/>
+          <w:szCs w:val="22"/>
+        </w:rPr>
+      </w:pPr>
+      <w:r>
+        <w:rPr>
+          <w:noProof/>
+          <w:szCs w:val="22"/>
+          <w:u w:val="single"/>
+        </w:rPr>
+        <w:drawing>
+          <wp:inline distT="0" distB="0" distL="0" distR="0" wp14:anchorId="79A2BAE9" wp14:editId="72E9866F">
+            <wp:extent cx="3902298" cy="3248997"/>
+            <wp:effectExtent l="0" t="0" r="0" b="2540"/>
+            <wp:docPr id="513926667" name="Picture 1" descr="A diagram of a house&#10;&#10;AI-generated content may be incorrect."/>
+            <wp:cNvGraphicFramePr>
+              <a:graphicFrameLocks xmlns:a="http://schemas.openxmlformats.org/drawingml/2006/main" noChangeAspect="1"/>
+            </wp:cNvGraphicFramePr>
+            <a:graphic xmlns:a="http://schemas.openxmlformats.org/drawingml/2006/main">
+              <a:graphicData uri="http://schemas.openxmlformats.org/drawingml/2006/picture">
+                <pic:pic xmlns:pic="http://schemas.openxmlformats.org/drawingml/2006/picture">
+                  <pic:nvPicPr>
+                    <pic:cNvPr id="513926667" name="Picture 1" descr="A diagram of a house&#10;&#10;AI-generated content may be incorrect."/>
+                    <pic:cNvPicPr/>
+                  </pic:nvPicPr>
+                  <pic:blipFill>
+                    <a:blip r:embed="rId7"/>
+                    <a:stretch>
+                      <a:fillRect/>
+                    </a:stretch>
+                  </pic:blipFill>
+                  <pic:spPr>
+                    <a:xfrm>
+                      <a:off x="0" y="0"/>
+                      <a:ext cx="3931372" cy="3273204"/>
+                    </a:xfrm>
+                    <a:prstGeom prst="rect">
+                      <a:avLst/>
+                    </a:prstGeom>
+                  </pic:spPr>
+                </pic:pic>
+              </a:graphicData>
+            </a:graphic>
+          </wp:inline>
+        </w:drawing>
       </w:r>
     </w:p>
     <w:p>
@@ -2579,6 +3260,22 @@
         </w:rPr>
         <w:t xml:space="preserve">Varying assortment </w:t>
       </w:r>
+    </w:p>
+    <w:p>
+      <w:pPr>
+        <w:jc w:val="both"/>
+        <w:rPr>
+          <w:szCs w:val="22"/>
+        </w:rPr>
+      </w:pPr>
+    </w:p>
+    <w:p>
+      <w:pPr>
+        <w:jc w:val="both"/>
+        <w:rPr>
+          <w:szCs w:val="22"/>
+        </w:rPr>
+      </w:pPr>
     </w:p>
     <w:p>
       <w:pPr>
@@ -3674,7 +4371,6 @@
     <w:basedOn w:val="Normal"/>
     <w:next w:val="Normal"/>
     <w:uiPriority w:val="35"/>
-    <w:semiHidden/>
     <w:unhideWhenUsed/>
     <w:qFormat/>
     <w:rsid w:val="008D7EA2"/>
@@ -4031,4 +4727,16 @@
     </a:ext>
   </a:extLst>
 </a:theme>
+</file>
+
+<file path=customXml/item1.xml><?xml version="1.0" encoding="utf-8"?>
+<b:Sources xmlns:b="http://schemas.openxmlformats.org/officeDocument/2006/bibliography" xmlns="http://schemas.openxmlformats.org/officeDocument/2006/bibliography" SelectedStyle="/APASixthEditionOfficeOnline.xsl" StyleName="APA" Version="6"/>
+</file>
+
+<file path=customXml/itemProps1.xml><?xml version="1.0" encoding="utf-8"?>
+<ds:datastoreItem xmlns:ds="http://schemas.openxmlformats.org/officeDocument/2006/customXml" ds:itemID="{BBFD448E-E934-B248-8A15-6CBB6400BB60}">
+  <ds:schemaRefs>
+    <ds:schemaRef ds:uri="http://schemas.openxmlformats.org/officeDocument/2006/bibliography"/>
+  </ds:schemaRefs>
+</ds:datastoreItem>
 </file>
</xml_diff>

<commit_message>
a few minor updates
</commit_message>
<xml_diff>
--- a/writeup/InfluenzaAgriculture.docx
+++ b/writeup/InfluenzaAgriculture.docx
@@ -577,6 +577,134 @@
       <w:r>
         <w:rPr>
           <w:szCs w:val="22"/>
+        </w:rPr>
+        <w:t xml:space="preserve">Some types of lettuce are harvested multiple times per head; maybe stick with iceberg </w:t>
+      </w:r>
+      <w:r>
+        <w:rPr>
+          <w:szCs w:val="22"/>
+        </w:rPr>
+        <w:t>(</w:t>
+      </w:r>
+      <w:hyperlink r:id="rId6" w:history="1">
+        <w:r>
+          <w:rPr>
+            <w:rStyle w:val="Hyperlink"/>
+            <w:szCs w:val="22"/>
+          </w:rPr>
+          <w:t>https://coststudyfiles.ucdavis.edu/uploads/pub/2023/08/04/2023-iceberglettuce-full-final.pdf</w:t>
+        </w:r>
+      </w:hyperlink>
+      <w:r>
+        <w:rPr>
+          <w:szCs w:val="22"/>
+        </w:rPr>
+        <w:t>) since it’s generally only harvested once, at maturity [</w:t>
+      </w:r>
+      <w:hyperlink r:id="rId7" w:anchor=":~:text=Can%20Keep%20Growing-,Crisphead%20(Iceberg)%20Lettuce,a%20full%20head%20when%20mature." w:history="1">
+        <w:r>
+          <w:rPr>
+            <w:rStyle w:val="Hyperlink"/>
+            <w:szCs w:val="22"/>
+          </w:rPr>
+          <w:t>x</w:t>
+        </w:r>
+      </w:hyperlink>
+      <w:r>
+        <w:rPr>
+          <w:szCs w:val="22"/>
+        </w:rPr>
+        <w:t xml:space="preserve">]. </w:t>
+      </w:r>
+    </w:p>
+    <w:p>
+      <w:pPr>
+        <w:jc w:val="both"/>
+        <w:rPr>
+          <w:szCs w:val="22"/>
+        </w:rPr>
+      </w:pPr>
+    </w:p>
+    <w:p>
+      <w:pPr>
+        <w:jc w:val="both"/>
+        <w:rPr>
+          <w:szCs w:val="22"/>
+        </w:rPr>
+      </w:pPr>
+      <w:r>
+        <w:rPr>
+          <w:szCs w:val="22"/>
+        </w:rPr>
+        <w:t>Strawberries are harvested every 2-3 days, suggesting they need to be harvested within that window to maintain quality [</w:t>
+      </w:r>
+      <w:hyperlink r:id="rId8" w:history="1">
+        <w:r>
+          <w:rPr>
+            <w:rStyle w:val="Hyperlink"/>
+            <w:szCs w:val="22"/>
+          </w:rPr>
+          <w:t>x</w:t>
+        </w:r>
+      </w:hyperlink>
+      <w:r>
+        <w:rPr>
+          <w:szCs w:val="22"/>
+        </w:rPr>
+        <w:t>]. For the time a crop can spend in the field, we might try 3 days for strawberries, one week for lettuce, and 60 days for oranges</w:t>
+      </w:r>
+      <w:r>
+        <w:rPr>
+          <w:szCs w:val="22"/>
+        </w:rPr>
+        <w:t xml:space="preserve"> [</w:t>
+      </w:r>
+      <w:hyperlink r:id="rId9" w:history="1">
+        <w:r>
+          <w:rPr>
+            <w:rStyle w:val="Hyperlink"/>
+            <w:szCs w:val="22"/>
+          </w:rPr>
+          <w:t>x</w:t>
+        </w:r>
+      </w:hyperlink>
+      <w:r>
+        <w:rPr>
+          <w:szCs w:val="22"/>
+        </w:rPr>
+        <w:t>]</w:t>
+      </w:r>
+      <w:r>
+        <w:rPr>
+          <w:szCs w:val="22"/>
+        </w:rPr>
+        <w:t xml:space="preserve">. So, we might have a plot showing labor lost over time (not accounting for field storage) and crop lost, accounting for field storage. </w:t>
+      </w:r>
+      <w:r>
+        <w:rPr>
+          <w:szCs w:val="22"/>
+        </w:rPr>
+        <w:t xml:space="preserve">This emphasizes that the epidemic would probably lead to delays in the orange harvest but lost harvest for lettuce and especially strawberries. </w:t>
+      </w:r>
+    </w:p>
+    <w:p>
+      <w:pPr>
+        <w:jc w:val="both"/>
+        <w:rPr>
+          <w:szCs w:val="22"/>
+        </w:rPr>
+      </w:pPr>
+    </w:p>
+    <w:p>
+      <w:pPr>
+        <w:jc w:val="both"/>
+        <w:rPr>
+          <w:szCs w:val="22"/>
+        </w:rPr>
+      </w:pPr>
+      <w:r>
+        <w:rPr>
+          <w:szCs w:val="22"/>
           <w:u w:val="single"/>
         </w:rPr>
         <w:t>Disease transmission model.</w:t>
@@ -737,6 +865,7 @@
         <w:rPr>
           <w:szCs w:val="22"/>
         </w:rPr>
+        <w:lastRenderedPageBreak/>
         <w:t xml:space="preserve">To set the within-household transmission rate </w:t>
       </w:r>
       <w:r>
@@ -1008,15 +1137,7 @@
           <w:szCs w:val="22"/>
           <w:lang w:val="en-GB"/>
         </w:rPr>
-        <w:t xml:space="preserve">This reflects the estimated reproduction number for influenza [x] and is in line with the effective reproduction </w:t>
-      </w:r>
-      <w:r>
-        <w:rPr>
-          <w:szCs w:val="22"/>
-          <w:lang w:val="en-GB"/>
-        </w:rPr>
-        <w:lastRenderedPageBreak/>
-        <w:t xml:space="preserve">number during surges of COVID-19 [x]. </w:t>
+        <w:t xml:space="preserve">This reflects the estimated reproduction number for influenza [x] and is in line with the effective reproduction number during surges of COVID-19 [x]. </w:t>
       </w:r>
       <w:r>
         <w:rPr>
@@ -2948,7 +3069,7 @@
                     <pic:cNvPicPr/>
                   </pic:nvPicPr>
                   <pic:blipFill>
-                    <a:blip r:embed="rId6" cstate="print">
+                    <a:blip r:embed="rId10" cstate="print">
                       <a:extLst>
                         <a:ext uri="{28A0092B-C50C-407E-A947-70E740481C1C}">
                           <a14:useLocalDpi xmlns:a14="http://schemas.microsoft.com/office/drawing/2010/main" val="0"/>
@@ -3114,7 +3235,7 @@
                     <pic:cNvPicPr/>
                   </pic:nvPicPr>
                   <pic:blipFill>
-                    <a:blip r:embed="rId7"/>
+                    <a:blip r:embed="rId11"/>
                     <a:stretch>
                       <a:fillRect/>
                     </a:stretch>
@@ -4431,6 +4552,29 @@
       <w:color w:val="666666"/>
     </w:rPr>
   </w:style>
+  <w:style w:type="character" w:styleId="Hyperlink">
+    <w:name w:val="Hyperlink"/>
+    <w:basedOn w:val="DefaultParagraphFont"/>
+    <w:uiPriority w:val="99"/>
+    <w:unhideWhenUsed/>
+    <w:rsid w:val="00155A19"/>
+    <w:rPr>
+      <w:color w:val="0563C1" w:themeColor="hyperlink"/>
+      <w:u w:val="single"/>
+    </w:rPr>
+  </w:style>
+  <w:style w:type="character" w:styleId="UnresolvedMention">
+    <w:name w:val="Unresolved Mention"/>
+    <w:basedOn w:val="DefaultParagraphFont"/>
+    <w:uiPriority w:val="99"/>
+    <w:semiHidden/>
+    <w:unhideWhenUsed/>
+    <w:rsid w:val="00155A19"/>
+    <w:rPr>
+      <w:color w:val="605E5C"/>
+      <w:shd w:val="clear" w:color="auto" w:fill="E1DFDD"/>
+    </w:rPr>
+  </w:style>
 </w:styles>
 </file>
 

</xml_diff>

<commit_message>
mostly notes and brainstorming.
</commit_message>
<xml_diff>
--- a/writeup/InfluenzaAgriculture.docx
+++ b/writeup/InfluenzaAgriculture.docx
@@ -2979,6 +2979,58 @@
     </w:p>
     <w:p>
       <w:pPr>
+        <w:pStyle w:val="ListParagraph"/>
+        <w:numPr>
+          <w:ilvl w:val="0"/>
+          <w:numId w:val="11"/>
+        </w:numPr>
+        <w:jc w:val="both"/>
+        <w:rPr>
+          <w:szCs w:val="22"/>
+        </w:rPr>
+      </w:pPr>
+      <w:r>
+        <w:rPr>
+          <w:szCs w:val="22"/>
+        </w:rPr>
+        <w:t xml:space="preserve">In the crop-level analysis, we don’t consider multiple crops simultaneously: it’s hard to know how the amount that labor is “stretched” across multiple crops being harvested at the same time might impact the availability of labor. </w:t>
+      </w:r>
+    </w:p>
+    <w:p>
+      <w:pPr>
+        <w:pStyle w:val="ListParagraph"/>
+        <w:numPr>
+          <w:ilvl w:val="0"/>
+          <w:numId w:val="11"/>
+        </w:numPr>
+        <w:jc w:val="both"/>
+        <w:rPr>
+          <w:szCs w:val="22"/>
+        </w:rPr>
+      </w:pPr>
+      <w:r>
+        <w:rPr>
+          <w:szCs w:val="22"/>
+        </w:rPr>
+        <w:t xml:space="preserve">A potential point about the R0: we might expect lower apparent R0 at higher spatial scales since we’re summing a bunch of epidemic curves that take place over a long </w:t>
+      </w:r>
+      <w:proofErr w:type="spellStart"/>
+      <w:r>
+        <w:rPr>
+          <w:szCs w:val="22"/>
+        </w:rPr>
+        <w:t>timespan</w:t>
+      </w:r>
+      <w:proofErr w:type="spellEnd"/>
+      <w:r>
+        <w:rPr>
+          <w:szCs w:val="22"/>
+        </w:rPr>
+        <w:t xml:space="preserve"> – lots of the curves we add will be zeros. </w:t>
+      </w:r>
+    </w:p>
+    <w:p>
+      <w:pPr>
         <w:jc w:val="both"/>
         <w:rPr>
           <w:szCs w:val="22"/>
@@ -3054,7 +3106,7 @@
           <w:szCs w:val="22"/>
         </w:rPr>
         <w:drawing>
-          <wp:inline distT="0" distB="0" distL="0" distR="0" wp14:anchorId="584FAB00" wp14:editId="34DB3041">
+          <wp:inline distT="0" distB="0" distL="0" distR="0" wp14:anchorId="584FAB00" wp14:editId="2065BA64">
             <wp:extent cx="5156200" cy="5448300"/>
             <wp:effectExtent l="0" t="0" r="0" b="0"/>
             <wp:docPr id="594262345" name="Picture 1"/>

</xml_diff>